<commit_message>
update: dong bo so lieu Case 2 va cap nhat bao cao Word
</commit_message>
<xml_diff>
--- a/backend/training/results/BAO_CAO_THUC_NGHIEM_5_CASE_NHAN_DIEN_KHUON_MAT.docx
+++ b/backend/training/results/BAO_CAO_THUC_NGHIEM_5_CASE_NHAN_DIEN_KHUON_MAT.docx
@@ -118,7 +118,7 @@
         <w:rPr>
           <w:sz w:val="24"/>
         </w:rPr>
-        <w:t>Ngày xuất báo cáo: 10/06/2026 09:33</w:t>
+        <w:t>Ngày xuất báo cáo: 10/06/2026 17:24</w:t>
         <w:br/>
       </w:r>
     </w:p>
@@ -1261,7 +1261,7 @@
               <w:rPr>
                 <w:sz w:val="20"/>
               </w:rPr>
-              <w:t>0.0271 ms</w:t>
+              <w:t>0.0087 ms</w:t>
             </w:r>
           </w:p>
         </w:tc>
@@ -1355,7 +1355,7 @@
               <w:rPr>
                 <w:sz w:val="20"/>
               </w:rPr>
-              <w:t>18.75%</w:t>
+              <w:t>18.85%</w:t>
             </w:r>
           </w:p>
         </w:tc>
@@ -1401,7 +1401,7 @@
               <w:rPr>
                 <w:sz w:val="20"/>
               </w:rPr>
-              <w:t>17.28%</w:t>
+              <w:t>17.38%</w:t>
             </w:r>
           </w:p>
         </w:tc>
@@ -1424,7 +1424,7 @@
               <w:rPr>
                 <w:sz w:val="20"/>
               </w:rPr>
-              <w:t>0.6417</w:t>
+              <w:t>0.6418</w:t>
             </w:r>
           </w:p>
         </w:tc>
@@ -1470,7 +1470,7 @@
               <w:rPr>
                 <w:sz w:val="20"/>
               </w:rPr>
-              <w:t>0.0102 ms</w:t>
+              <w:t>0.0051 ms</w:t>
             </w:r>
           </w:p>
         </w:tc>
@@ -1488,7 +1488,7 @@
         <w:t>Ý nghĩa:</w:t>
       </w:r>
       <w:r>
-        <w:t xml:space="preserve"> Kết quả khoảng 48-50% cho thấy mô hình fine-tune ResNet-18 hiện tại không tổng quát tốt từ enroll sang ảnh real.</w:t>
+        <w:t xml:space="preserve"> Kết quả khoảng 20.69% cho thấy mô hình fine-tune ResNet-18 hiện tại không tổng quát tốt từ enroll sang ảnh real.</w:t>
       </w:r>
     </w:p>
     <w:p>
@@ -1943,7 +1943,7 @@
               <w:rPr>
                 <w:sz w:val="20"/>
               </w:rPr>
-              <w:t>0.8294</w:t>
+              <w:t>0.5967</w:t>
             </w:r>
           </w:p>
         </w:tc>
@@ -1989,7 +1989,7 @@
               <w:rPr>
                 <w:sz w:val="20"/>
               </w:rPr>
-              <w:t>0.0101 ms</w:t>
+              <w:t>0.0008 ms</w:t>
             </w:r>
           </w:p>
         </w:tc>
@@ -2152,7 +2152,7 @@
               <w:rPr>
                 <w:sz w:val="20"/>
               </w:rPr>
-              <w:t>0.8294</w:t>
+              <w:t>0.5967</w:t>
             </w:r>
           </w:p>
         </w:tc>
@@ -2198,7 +2198,7 @@
               <w:rPr>
                 <w:sz w:val="20"/>
               </w:rPr>
-              <w:t>0.0092 ms</w:t>
+              <w:t>0.0020 ms</w:t>
             </w:r>
           </w:p>
         </w:tc>
@@ -2525,7 +2525,7 @@
               <w:rPr>
                 <w:sz w:val="20"/>
               </w:rPr>
-              <w:t>0.0041 ms</w:t>
+              <w:t>0.0023 ms</w:t>
             </w:r>
           </w:p>
         </w:tc>
@@ -2548,7 +2548,7 @@
               <w:rPr>
                 <w:sz w:val="20"/>
               </w:rPr>
-              <w:t>0.0066 ms</w:t>
+              <w:t>0.0046 ms</w:t>
             </w:r>
           </w:p>
         </w:tc>
@@ -2571,7 +2571,7 @@
               <w:rPr>
                 <w:sz w:val="20"/>
               </w:rPr>
-              <w:t>0.0259 ms</w:t>
+              <w:t>0.0156 ms</w:t>
             </w:r>
           </w:p>
         </w:tc>
@@ -2594,7 +2594,7 @@
               <w:rPr>
                 <w:sz w:val="20"/>
               </w:rPr>
-              <w:t>0.1336 ms</w:t>
+              <w:t>0.0700 ms</w:t>
             </w:r>
           </w:p>
         </w:tc>
@@ -2687,6 +2687,29 @@
               <w:rPr>
                 <w:sz w:val="20"/>
               </w:rPr>
+              <w:t>0.0053 ms</w:t>
+            </w:r>
+          </w:p>
+        </w:tc>
+        <w:tc>
+          <w:tcPr>
+            <w:tcW w:type="dxa" w:w="1344"/>
+            <w:tcMar>
+              <w:top w:w="80" w:type="dxa"/>
+              <w:bottom w:w="80" w:type="dxa"/>
+              <w:left w:w="100" w:type="dxa"/>
+              <w:right w:w="100" w:type="dxa"/>
+            </w:tcMar>
+            <w:vAlign w:val="center"/>
+          </w:tcPr>
+          <w:p>
+            <w:pPr>
+              <w:jc w:val="center"/>
+            </w:pPr>
+            <w:r>
+              <w:rPr>
+                <w:sz w:val="20"/>
+              </w:rPr>
               <w:t>0.0075 ms</w:t>
             </w:r>
           </w:p>
@@ -2710,7 +2733,7 @@
               <w:rPr>
                 <w:sz w:val="20"/>
               </w:rPr>
-              <w:t>0.0102 ms</w:t>
+              <w:t>0.0141 ms</w:t>
             </w:r>
           </w:p>
         </w:tc>
@@ -2733,30 +2756,7 @@
               <w:rPr>
                 <w:sz w:val="20"/>
               </w:rPr>
-              <w:t>0.0334 ms</w:t>
-            </w:r>
-          </w:p>
-        </w:tc>
-        <w:tc>
-          <w:tcPr>
-            <w:tcW w:type="dxa" w:w="1344"/>
-            <w:tcMar>
-              <w:top w:w="80" w:type="dxa"/>
-              <w:bottom w:w="80" w:type="dxa"/>
-              <w:left w:w="100" w:type="dxa"/>
-              <w:right w:w="100" w:type="dxa"/>
-            </w:tcMar>
-            <w:vAlign w:val="center"/>
-          </w:tcPr>
-          <w:p>
-            <w:pPr>
-              <w:jc w:val="center"/>
-            </w:pPr>
-            <w:r>
-              <w:rPr>
-                <w:sz w:val="20"/>
-              </w:rPr>
-              <w:t>0.0420 ms</w:t>
+              <w:t>0.0349 ms</w:t>
             </w:r>
           </w:p>
         </w:tc>
@@ -2810,7 +2810,7 @@
         <w:t>Vấn đề cần lưu ý:</w:t>
       </w:r>
       <w:r>
-        <w:t xml:space="preserve"> Kết quả thực nghiệm cho thấy HNSW vượt trội rõ rệt so với FAISS Flat khi N tăng lớn (nhanh hơn Flat gấp hơn 2 lần ở quy mô 16k: 0.0379 ms vs 0.0828 ms).</w:t>
+        <w:t xml:space="preserve"> Kết quả thực nghiệm cho thấy HNSW vượt trội rõ rệt so với FAISS Flat khi N tăng lớn (nhanh hơn Flat gấp 3.18 lần ở quy mô 16k: 0.0420 ms vs 0.1336 ms).</w:t>
       </w:r>
     </w:p>
     <w:p>
@@ -3251,7 +3251,7 @@
               <w:rPr>
                 <w:sz w:val="20"/>
               </w:rPr>
-              <w:t>0.1938</w:t>
+              <w:t>0.1719</w:t>
             </w:r>
           </w:p>
         </w:tc>
@@ -3297,7 +3297,7 @@
               <w:rPr>
                 <w:sz w:val="20"/>
               </w:rPr>
-              <w:t>0.0149 ms</w:t>
+              <w:t>0.0022 ms</w:t>
             </w:r>
           </w:p>
         </w:tc>
@@ -3460,7 +3460,7 @@
               <w:rPr>
                 <w:sz w:val="20"/>
               </w:rPr>
-              <w:t>0.1935</w:t>
+              <w:t>0.1719</w:t>
             </w:r>
           </w:p>
         </w:tc>
@@ -3506,7 +3506,7 @@
               <w:rPr>
                 <w:sz w:val="20"/>
               </w:rPr>
-              <w:t>0.0195 ms</w:t>
+              <w:t>0.0026 ms</w:t>
             </w:r>
           </w:p>
         </w:tc>
@@ -3524,7 +3524,7 @@
         <w:t>Ý nghĩa:</w:t>
       </w:r>
       <w:r>
-        <w:t xml:space="preserve"> Đánh giá khả năng từ chối người lạ bằng tập dữ liệu 125 ảnh người lạ từ internet.</w:t>
+        <w:t xml:space="preserve"> Đánh giá khả năng từ chối người lạ bằng tập dữ liệu 85 ảnh người lạ từ internet.</w:t>
       </w:r>
     </w:p>
     <w:p>
@@ -4025,7 +4025,7 @@
               <w:rPr>
                 <w:sz w:val="20"/>
               </w:rPr>
-              <w:t>0.0034 ms</w:t>
+              <w:t>0.0014 ms</w:t>
             </w:r>
           </w:p>
         </w:tc>
@@ -4234,7 +4234,7 @@
               <w:rPr>
                 <w:sz w:val="20"/>
               </w:rPr>
-              <w:t>0.0123 ms</w:t>
+              <w:t>0.0124 ms</w:t>
             </w:r>
           </w:p>
         </w:tc>
@@ -4443,7 +4443,7 @@
               <w:rPr>
                 <w:sz w:val="20"/>
               </w:rPr>
-              <w:t>0.0180 ms</w:t>
+              <w:t>0.0110 ms</w:t>
             </w:r>
           </w:p>
         </w:tc>
@@ -4461,7 +4461,7 @@
         <w:t>Ý nghĩa:</w:t>
       </w:r>
       <w:r>
-        <w:t xml:space="preserve"> Case này chứng minh độ hiệu quả của cơ chế tự động cập nhật thư viện ảnh. Độ chính xác giữ vững 100.00% trong khi similarity trung bình tăng mạnh từ 0.5785 lên 0.7771.</w:t>
+        <w:t xml:space="preserve"> Case này chứng minh độ hiệu quả của cơ chế tự động cập nhật thư viện ảnh. Độ chính xác giữ vững 100.00% trong khi similarity trung bình tăng mạnh từ 0.5782 lên 0.7771.</w:t>
       </w:r>
     </w:p>
     <w:p>
@@ -4533,7 +4533,7 @@
         <w:spacing w:after="60"/>
       </w:pPr>
       <w:r>
-        <w:t>Cơ chế Progressive Gallery Enrichment giúp tăng cường similarity trung bình (+19.86%), giúp nhận diện ngày càng nhạy bén hơn mà không làm giảm độ an toàn (unk. rej. giữ vững 100%).</w:t>
+        <w:t>Cơ chế Progressive Gallery Enrichment giúp tăng cường similarity trung bình (+19.89%), giúp nhận diện ngày càng nhạy bén hơn mà không làm giảm độ an toàn (unk. rej. giữ vững 100%).</w:t>
       </w:r>
     </w:p>
     <w:p>

</xml_diff>

<commit_message>
update: chay lai kịch bản Case 3 voi bo du lieu 16k sinh vien moi
</commit_message>
<xml_diff>
--- a/backend/training/results/BAO_CAO_THUC_NGHIEM_5_CASE_NHAN_DIEN_KHUON_MAT.docx
+++ b/backend/training/results/BAO_CAO_THUC_NGHIEM_5_CASE_NHAN_DIEN_KHUON_MAT.docx
@@ -118,7 +118,7 @@
         <w:rPr>
           <w:sz w:val="24"/>
         </w:rPr>
-        <w:t>Ngày xuất báo cáo: 10/06/2026 17:24</w:t>
+        <w:t>Ngày xuất báo cáo: 10/06/2026 18:37</w:t>
         <w:br/>
       </w:r>
     </w:p>
@@ -799,6 +799,50 @@
         <w:t>3. Case 1 - Fine-tune ResNet-18</w:t>
       </w:r>
     </w:p>
+    <w:p>
+      <w:pPr>
+        <w:spacing w:after="120" w:line="276" w:lineRule="auto"/>
+      </w:pPr>
+      <w:r>
+        <w:t>Mô tả thiết kế thực nghiệm:</w:t>
+      </w:r>
+    </w:p>
+    <w:p>
+      <w:pPr>
+        <w:pStyle w:val="ListBullet"/>
+        <w:spacing w:after="60"/>
+      </w:pPr>
+      <w:r>
+        <w:t>Huấn luyện: Sử dụng mạng ResNet-18 ArcFace được tinh chỉnh (fine-tune) trên tập huấn luyện đăng ký trong 40 epochs.</w:t>
+      </w:r>
+    </w:p>
+    <w:p>
+      <w:pPr>
+        <w:pStyle w:val="ListBullet"/>
+        <w:spacing w:after="60"/>
+      </w:pPr>
+      <w:r>
+        <w:t>Bộ dữ liệu: Tập huấn luyện gồm ảnh enroll của 39 sinh viên được nhân bản 25 lần (975 ảnh). Tập kiểm thử (test) gồm 174 ảnh thực tế từ webcam lớp học.</w:t>
+      </w:r>
+    </w:p>
+    <w:p>
+      <w:pPr>
+        <w:pStyle w:val="ListBullet"/>
+        <w:spacing w:after="60"/>
+      </w:pPr>
+      <w:r>
+        <w:t>Data Augmentation: Áp dụng trên tập huấn luyện (Resize, RandomHorizontalFlip, RandomRotation, ColorJitter) để mô hình học từ ảnh thẻ gốc; không áp dụng trên tập test thực tế để đo đúng độ tin cậy nguyên bản.</w:t>
+      </w:r>
+    </w:p>
+    <w:p>
+      <w:pPr>
+        <w:pStyle w:val="ListBullet"/>
+        <w:spacing w:after="60"/>
+      </w:pPr>
+      <w:r>
+        <w:t>So khớp: Lấy ảnh enroll gốc tăng cường 15 lần (624 vector) làm Gallery; dùng 174 vector ảnh real làm Query so khớp qua FAISS Flat/HNSW.</w:t>
+      </w:r>
+    </w:p>
     <w:tbl>
       <w:tblPr>
         <w:tblStyle w:val="TableGrid"/>
@@ -1261,7 +1305,7 @@
               <w:rPr>
                 <w:sz w:val="20"/>
               </w:rPr>
-              <w:t>0.0087 ms</w:t>
+              <w:t>0.0211 ms</w:t>
             </w:r>
           </w:p>
         </w:tc>
@@ -1355,7 +1399,7 @@
               <w:rPr>
                 <w:sz w:val="20"/>
               </w:rPr>
-              <w:t>18.85%</w:t>
+              <w:t>19.53%</w:t>
             </w:r>
           </w:p>
         </w:tc>
@@ -1401,7 +1445,7 @@
               <w:rPr>
                 <w:sz w:val="20"/>
               </w:rPr>
-              <w:t>17.38%</w:t>
+              <w:t>17.15%</w:t>
             </w:r>
           </w:p>
         </w:tc>
@@ -1424,7 +1468,7 @@
               <w:rPr>
                 <w:sz w:val="20"/>
               </w:rPr>
-              <w:t>0.6418</w:t>
+              <w:t>0.6416</w:t>
             </w:r>
           </w:p>
         </w:tc>
@@ -1470,7 +1514,7 @@
               <w:rPr>
                 <w:sz w:val="20"/>
               </w:rPr>
-              <w:t>0.0051 ms</w:t>
+              <w:t>0.0080 ms</w:t>
             </w:r>
           </w:p>
         </w:tc>
@@ -1525,6 +1569,50 @@
       </w:pPr>
       <w:r>
         <w:t>4. Case 2 - ArcFace Pretrained</w:t>
+      </w:r>
+    </w:p>
+    <w:p>
+      <w:pPr>
+        <w:spacing w:after="120" w:line="276" w:lineRule="auto"/>
+      </w:pPr>
+      <w:r>
+        <w:t>Mô tả thiết kế thực nghiệm:</w:t>
+      </w:r>
+    </w:p>
+    <w:p>
+      <w:pPr>
+        <w:pStyle w:val="ListBullet"/>
+        <w:spacing w:after="60"/>
+      </w:pPr>
+      <w:r>
+        <w:t>Huấn luyện: Không thực hiện tinh chỉnh (pretrained), sử dụng trực tiếp mô hình ArcFace ResNet-50 (buffalo_l) có sẵn của InsightFace để trích xuất đặc trưng.</w:t>
+      </w:r>
+    </w:p>
+    <w:p>
+      <w:pPr>
+        <w:pStyle w:val="ListBullet"/>
+        <w:spacing w:after="60"/>
+      </w:pPr>
+      <w:r>
+        <w:t>Bộ dữ liệu: Tập Gallery gồm ảnh enroll của 39 sinh viên. Tập kiểm thử (test) gồm đúng 174 ảnh thực tế từ webcam lớp học (đồng bộ với Case 1).</w:t>
+      </w:r>
+    </w:p>
+    <w:p>
+      <w:pPr>
+        <w:pStyle w:val="ListBullet"/>
+        <w:spacing w:after="60"/>
+      </w:pPr>
+      <w:r>
+        <w:t>Data Augmentation: Áp dụng Albumentations sinh thêm 15 ảnh biến thể cho mỗi sinh viên để làm giàu Gallery (tổng cộng 624 vector); tập test 174 ảnh không áp dụng augmentation để đo đúng chất lượng thực tế.</w:t>
+      </w:r>
+    </w:p>
+    <w:p>
+      <w:pPr>
+        <w:pStyle w:val="ListBullet"/>
+        <w:spacing w:after="60"/>
+      </w:pPr>
+      <w:r>
+        <w:t>So khớp: Truy vấn k-NN (k=1) tìm sinh viên khớp nhất trong Gallery qua FAISS Flat/HNSW.</w:t>
       </w:r>
     </w:p>
     <w:tbl>
@@ -1989,7 +2077,7 @@
               <w:rPr>
                 <w:sz w:val="20"/>
               </w:rPr>
-              <w:t>0.0008 ms</w:t>
+              <w:t>0.0019 ms</w:t>
             </w:r>
           </w:p>
         </w:tc>
@@ -2198,7 +2286,7 @@
               <w:rPr>
                 <w:sz w:val="20"/>
               </w:rPr>
-              <w:t>0.0020 ms</w:t>
+              <w:t>0.0031 ms</w:t>
             </w:r>
           </w:p>
         </w:tc>
@@ -2253,6 +2341,50 @@
       </w:pPr>
       <w:r>
         <w:t>5. Case 3 - Synthetic 16.000 Embeddings</w:t>
+      </w:r>
+    </w:p>
+    <w:p>
+      <w:pPr>
+        <w:spacing w:after="120" w:line="276" w:lineRule="auto"/>
+      </w:pPr>
+      <w:r>
+        <w:t>Mô tả thiết kế thực nghiệm:</w:t>
+      </w:r>
+    </w:p>
+    <w:p>
+      <w:pPr>
+        <w:pStyle w:val="ListBullet"/>
+        <w:spacing w:after="60"/>
+      </w:pPr>
+      <w:r>
+        <w:t>Huấn luyện: Không huấn luyện, kiểm thử trên dữ liệu vector đặc trưng giả lập có sẵn.</w:t>
+      </w:r>
+    </w:p>
+    <w:p>
+      <w:pPr>
+        <w:pStyle w:val="ListBullet"/>
+        <w:spacing w:after="60"/>
+      </w:pPr>
+      <w:r>
+        <w:t>Bộ dữ liệu: Tập Gallery gồm 16.000 vector đặc trưng (enroll_embeddings.npy). Tập truy vấn (test) gồm 500 vector đặc trưng (real_embeddings.npy).</w:t>
+      </w:r>
+    </w:p>
+    <w:p>
+      <w:pPr>
+        <w:pStyle w:val="ListBullet"/>
+        <w:spacing w:after="60"/>
+      </w:pPr>
+      <w:r>
+        <w:t>Data Augmentation: Không áp dụng do dữ liệu đầu vào đã ở dạng vector thô 512-D được trích xuất sẵn.</w:t>
+      </w:r>
+    </w:p>
+    <w:p>
+      <w:pPr>
+        <w:pStyle w:val="ListBullet"/>
+        <w:spacing w:after="60"/>
+      </w:pPr>
+      <w:r>
+        <w:t>Kiểm thử: Xây dựng chỉ mục Flat và HNSW ở các quy mô N = 500, 1.000, 5.000, 16.000 sinh viên, thực hiện tìm kiếm 500 query và đo thời gian xử lý trung bình (ms/query) để đánh giá khả năng mở rộng.</w:t>
       </w:r>
     </w:p>
     <w:tbl>
@@ -2525,7 +2657,7 @@
               <w:rPr>
                 <w:sz w:val="20"/>
               </w:rPr>
-              <w:t>0.0023 ms</w:t>
+              <w:t>0.0071 ms</w:t>
             </w:r>
           </w:p>
         </w:tc>
@@ -2548,7 +2680,7 @@
               <w:rPr>
                 <w:sz w:val="20"/>
               </w:rPr>
-              <w:t>0.0046 ms</w:t>
+              <w:t>0.0040 ms</w:t>
             </w:r>
           </w:p>
         </w:tc>
@@ -2571,7 +2703,7 @@
               <w:rPr>
                 <w:sz w:val="20"/>
               </w:rPr>
-              <w:t>0.0156 ms</w:t>
+              <w:t>0.0154 ms</w:t>
             </w:r>
           </w:p>
         </w:tc>
@@ -2594,7 +2726,7 @@
               <w:rPr>
                 <w:sz w:val="20"/>
               </w:rPr>
-              <w:t>0.0700 ms</w:t>
+              <w:t>0.0534 ms</w:t>
             </w:r>
           </w:p>
         </w:tc>
@@ -2687,7 +2819,7 @@
               <w:rPr>
                 <w:sz w:val="20"/>
               </w:rPr>
-              <w:t>0.0053 ms</w:t>
+              <w:t>0.0098 ms</w:t>
             </w:r>
           </w:p>
         </w:tc>
@@ -2710,7 +2842,7 @@
               <w:rPr>
                 <w:sz w:val="20"/>
               </w:rPr>
-              <w:t>0.0075 ms</w:t>
+              <w:t>0.0111 ms</w:t>
             </w:r>
           </w:p>
         </w:tc>
@@ -2733,7 +2865,7 @@
               <w:rPr>
                 <w:sz w:val="20"/>
               </w:rPr>
-              <w:t>0.0141 ms</w:t>
+              <w:t>0.0173 ms</w:t>
             </w:r>
           </w:p>
         </w:tc>
@@ -2756,7 +2888,7 @@
               <w:rPr>
                 <w:sz w:val="20"/>
               </w:rPr>
-              <w:t>0.0349 ms</w:t>
+              <w:t>0.0331 ms</w:t>
             </w:r>
           </w:p>
         </w:tc>
@@ -2833,6 +2965,50 @@
       </w:pPr>
       <w:r>
         <w:t>6. Case 4 - Unknown Rejection</w:t>
+      </w:r>
+    </w:p>
+    <w:p>
+      <w:pPr>
+        <w:spacing w:after="120" w:line="276" w:lineRule="auto"/>
+      </w:pPr>
+      <w:r>
+        <w:t>Mô tả thiết kế thực nghiệm:</w:t>
+      </w:r>
+    </w:p>
+    <w:p>
+      <w:pPr>
+        <w:pStyle w:val="ListBullet"/>
+        <w:spacing w:after="60"/>
+      </w:pPr>
+      <w:r>
+        <w:t>Huấn luyện: Không tinh chỉnh mô hình, trích xuất đặc trưng trực tiếp.</w:t>
+      </w:r>
+    </w:p>
+    <w:p>
+      <w:pPr>
+        <w:pStyle w:val="ListBullet"/>
+        <w:spacing w:after="60"/>
+      </w:pPr>
+      <w:r>
+        <w:t>Bộ dữ liệu: Tập Gallery gồm 624 vector đặc trưng của 39 sinh viên thật. Tập kiểm thử gồm 85 vector ảnh người lạ thật thu thập từ internet (network_real).</w:t>
+      </w:r>
+    </w:p>
+    <w:p>
+      <w:pPr>
+        <w:pStyle w:val="ListBullet"/>
+        <w:spacing w:after="60"/>
+      </w:pPr>
+      <w:r>
+        <w:t>Data Augmentation: Không áp dụng tăng cường ảnh người lạ để mô phỏng chính xác khung hình webcam người lạ đi qua camera.</w:t>
+      </w:r>
+    </w:p>
+    <w:p>
+      <w:pPr>
+        <w:pStyle w:val="ListBullet"/>
+        <w:spacing w:after="60"/>
+      </w:pPr>
+      <w:r>
+        <w:t>Kiểm thử: So khớp 85 ảnh người lạ vào Gallery sinh viên; nếu độ tương đồng lớn nhất nhỏ hơn ngưỡng 0.45, coi như từ chối thành công. Đo tỷ lệ từ chối đúng (Unknown Rejection Rate) và độ trễ tìm kiếm.</w:t>
       </w:r>
     </w:p>
     <w:tbl>
@@ -3297,7 +3473,7 @@
               <w:rPr>
                 <w:sz w:val="20"/>
               </w:rPr>
-              <w:t>0.0022 ms</w:t>
+              <w:t>0.0031 ms</w:t>
             </w:r>
           </w:p>
         </w:tc>
@@ -3506,7 +3682,7 @@
               <w:rPr>
                 <w:sz w:val="20"/>
               </w:rPr>
-              <w:t>0.0026 ms</w:t>
+              <w:t>0.0040 ms</w:t>
             </w:r>
           </w:p>
         </w:tc>
@@ -3561,6 +3737,50 @@
       </w:pPr>
       <w:r>
         <w:t>7. Case 5 - Progressive Gallery Enrichment</w:t>
+      </w:r>
+    </w:p>
+    <w:p>
+      <w:pPr>
+        <w:spacing w:after="120" w:line="276" w:lineRule="auto"/>
+      </w:pPr>
+      <w:r>
+        <w:t>Mô tả thiết kế thực nghiệm:</w:t>
+      </w:r>
+    </w:p>
+    <w:p>
+      <w:pPr>
+        <w:pStyle w:val="ListBullet"/>
+        <w:spacing w:after="60"/>
+      </w:pPr>
+      <w:r>
+        <w:t>Huấn luyện: Không huấn luyện mô hình học máy, tự động cập nhật thư viện ở tầng logic ứng dụng.</w:t>
+      </w:r>
+    </w:p>
+    <w:p>
+      <w:pPr>
+        <w:pStyle w:val="ListBullet"/>
+        <w:spacing w:after="60"/>
+      </w:pPr>
+      <w:r>
+        <w:t>Bộ dữ liệu: Dữ liệu của 39 sinh viên. Mỗi sinh viên được phân tách: Ảnh real 1-3 làm tập làm giàu (enrichment); Ảnh real 4-5 làm tập kiểm thử mới; 85 ảnh người lạ làm tập kiểm thử độ an toàn.</w:t>
+      </w:r>
+    </w:p>
+    <w:p>
+      <w:pPr>
+        <w:pStyle w:val="ListBullet"/>
+        <w:spacing w:after="60"/>
+      </w:pPr>
+      <w:r>
+        <w:t>Data Augmentation: Không áp dụng augmentation cho ảnh test; áp dụng logic tự động thêm ảnh real vào Gallery khi nhận diện đúng với độ tương đồng &gt;= 0.75.</w:t>
+      </w:r>
+    </w:p>
+    <w:p>
+      <w:pPr>
+        <w:pStyle w:val="ListBullet"/>
+        <w:spacing w:after="60"/>
+      </w:pPr>
+      <w:r>
+        <w:t>Kiểm thử: So sánh hiệu năng nhận diện và khả năng từ chối người lạ trước và sau khi làm giàu Gallery.</w:t>
       </w:r>
     </w:p>
     <w:tbl>
@@ -4025,7 +4245,7 @@
               <w:rPr>
                 <w:sz w:val="20"/>
               </w:rPr>
-              <w:t>0.0014 ms</w:t>
+              <w:t>0.0074 ms</w:t>
             </w:r>
           </w:p>
         </w:tc>
@@ -4234,7 +4454,7 @@
               <w:rPr>
                 <w:sz w:val="20"/>
               </w:rPr>
-              <w:t>0.0124 ms</w:t>
+              <w:t>0.0057 ms</w:t>
             </w:r>
           </w:p>
         </w:tc>
@@ -4443,7 +4663,7 @@
               <w:rPr>
                 <w:sz w:val="20"/>
               </w:rPr>
-              <w:t>0.0110 ms</w:t>
+              <w:t>0.0066 ms</w:t>
             </w:r>
           </w:p>
         </w:tc>

</xml_diff>